<commit_message>
Refresh proposal service cost notes
</commit_message>
<xml_diff>
--- a/docs/curated-car-rentals-proposal.docx
+++ b/docs/curated-car-rentals-proposal.docx
@@ -41,7 +41,7 @@
           <w:spacing w:val="0"/>
           <w:color w:val="3B4350"/>
         </w:rPr>
-        <w:t xml:space="preserve"> February 11, 2026</w:t>
+        <w:t xml:space="preserve"> March 28, 2026</w:t>
       </w:r>
     </w:p>
     <w:p>
@@ -1459,7 +1459,7 @@
           <w:spacing w:val="0"/>
           <w:color w:val="0E121D"/>
         </w:rPr>
-        <w:t xml:space="preserve">4) Third-Party Services &amp; Pricing (as of February 11, 2026)</w:t>
+        <w:t xml:space="preserve">4) Third-Party Services &amp; Pricing (as of March 28, 2026)</w:t>
       </w:r>
     </w:p>
     <w:p>
@@ -1596,65 +1596,65 @@
           <w:spacing w:val="0"/>
           <w:color w:val="0E121D"/>
         </w:rPr>
-        <w:t xml:space="preserve">Free: $0 (300 credit limit / month)</w:t>
-      </w:r>
-    </w:p>
-    <w:p>
-      <w:pPr>
-        <w:ind w:left="720" w:first-line="-720"/>
-        <w:spacing w:after="80"/>
-      </w:pPr>
-      <w:r>
-        <w:rPr>
-          <w:rFonts w:ascii="Helvetica Neue" w:hAnsi="Helvetica Neue" w:cs="Helvetica Neue"/>
-          <w:sz w:val="29"/>
-          <w:sz-cs w:val="29"/>
-          <w:color w:val="0E121D"/>
-        </w:rPr>
-        <w:t xml:space="preserve"/>
-        <w:tab/>
-        <w:t xml:space="preserve">•</w:t>
-        <w:tab/>
-        <w:t xml:space="preserve"/>
-      </w:r>
-      <w:r>
-        <w:rPr>
-          <w:rFonts w:ascii="Helvetica Neue" w:hAnsi="Helvetica Neue" w:cs="Helvetica Neue"/>
-          <w:sz w:val="29"/>
-          <w:sz-cs w:val="29"/>
-          <w:spacing w:val="0"/>
-          <w:color w:val="0E121D"/>
-        </w:rPr>
-        <w:t xml:space="preserve">Personal: $9 / month (1,000 credits / month)</w:t>
-      </w:r>
-    </w:p>
-    <w:p>
-      <w:pPr>
-        <w:ind w:left="720" w:first-line="-720"/>
-        <w:spacing w:after="80"/>
-      </w:pPr>
-      <w:r>
-        <w:rPr>
-          <w:rFonts w:ascii="Helvetica Neue" w:hAnsi="Helvetica Neue" w:cs="Helvetica Neue"/>
-          <w:sz w:val="29"/>
-          <w:sz-cs w:val="29"/>
-          <w:color w:val="0E121D"/>
-        </w:rPr>
-        <w:t xml:space="preserve"/>
-        <w:tab/>
-        <w:t xml:space="preserve">•</w:t>
-        <w:tab/>
-        <w:t xml:space="preserve"/>
-      </w:r>
-      <w:r>
-        <w:rPr>
-          <w:rFonts w:ascii="Helvetica Neue" w:hAnsi="Helvetica Neue" w:cs="Helvetica Neue"/>
-          <w:sz w:val="29"/>
-          <w:sz-cs w:val="29"/>
-          <w:spacing w:val="0"/>
-          <w:color w:val="0E121D"/>
-        </w:rPr>
-        <w:t xml:space="preserve">Pro: $20 per member / month (3,000 credits / month)</w:t>
+        <w:t xml:space="preserve">Free: $0 forever (300 credit limit / month)</w:t>
+      </w:r>
+    </w:p>
+    <w:p>
+      <w:pPr>
+        <w:ind w:left="720" w:first-line="-720"/>
+        <w:spacing w:after="80"/>
+      </w:pPr>
+      <w:r>
+        <w:rPr>
+          <w:rFonts w:ascii="Helvetica Neue" w:hAnsi="Helvetica Neue" w:cs="Helvetica Neue"/>
+          <w:sz w:val="29"/>
+          <w:sz-cs w:val="29"/>
+          <w:color w:val="0E121D"/>
+        </w:rPr>
+        <w:t xml:space="preserve"/>
+        <w:tab/>
+        <w:t xml:space="preserve">•</w:t>
+        <w:tab/>
+        <w:t xml:space="preserve"/>
+      </w:r>
+      <w:r>
+        <w:rPr>
+          <w:rFonts w:ascii="Helvetica Neue" w:hAnsi="Helvetica Neue" w:cs="Helvetica Neue"/>
+          <w:sz w:val="29"/>
+          <w:sz-cs w:val="29"/>
+          <w:spacing w:val="0"/>
+          <w:color w:val="0E121D"/>
+        </w:rPr>
+        <w:t xml:space="preserve">Personal: $9 / month (1,000 credits included / month)</w:t>
+      </w:r>
+    </w:p>
+    <w:p>
+      <w:pPr>
+        <w:ind w:left="720" w:first-line="-720"/>
+        <w:spacing w:after="80"/>
+      </w:pPr>
+      <w:r>
+        <w:rPr>
+          <w:rFonts w:ascii="Helvetica Neue" w:hAnsi="Helvetica Neue" w:cs="Helvetica Neue"/>
+          <w:sz w:val="29"/>
+          <w:sz-cs w:val="29"/>
+          <w:color w:val="0E121D"/>
+        </w:rPr>
+        <w:t xml:space="preserve"/>
+        <w:tab/>
+        <w:t xml:space="preserve">•</w:t>
+        <w:tab/>
+        <w:t xml:space="preserve"/>
+      </w:r>
+      <w:r>
+        <w:rPr>
+          <w:rFonts w:ascii="Helvetica Neue" w:hAnsi="Helvetica Neue" w:cs="Helvetica Neue"/>
+          <w:sz w:val="29"/>
+          <w:sz-cs w:val="29"/>
+          <w:spacing w:val="0"/>
+          <w:color w:val="0E121D"/>
+        </w:rPr>
+        <w:t xml:space="preserve">Pro: $20 per member / month (5,000 credits included / team / month)</w:t>
       </w:r>
     </w:p>
     <w:p>
@@ -1862,7 +1862,7 @@
           <w:spacing w:val="0"/>
           <w:color w:val="3B4350"/>
         </w:rPr>
-        <w:t xml:space="preserve">Best for predictable Postgres with good dev experience; final cost depends on compute + storage.</w:t>
+        <w:t xml:space="preserve">Managed Postgres with a good developer experience; actual spend depends on compute, storage, and egress.</w:t>
       </w:r>
     </w:p>
     <w:p>
@@ -1928,7 +1928,7 @@
           <w:spacing w:val="0"/>
           <w:color w:val="0E121D"/>
         </w:rPr>
-        <w:t xml:space="preserve">Free: $0 / month (3,000 emails / month)</w:t>
+        <w:t xml:space="preserve">Free: $0 / month (3,000 emails / month, 100 / day)</w:t>
       </w:r>
     </w:p>
     <w:p>
@@ -2123,94 +2123,94 @@
           <w:spacing w:val="0"/>
           <w:color w:val="0E121D"/>
         </w:rPr>
-        <w:t xml:space="preserve">Starter: €5 / month (≈ $5.95 USD) (300 documents / month)</w:t>
-      </w:r>
-    </w:p>
-    <w:p>
-      <w:pPr>
-        <w:ind w:left="720" w:first-line="-720"/>
-        <w:spacing w:after="80"/>
-      </w:pPr>
-      <w:r>
-        <w:rPr>
-          <w:rFonts w:ascii="Helvetica Neue" w:hAnsi="Helvetica Neue" w:cs="Helvetica Neue"/>
-          <w:sz w:val="29"/>
-          <w:sz-cs w:val="29"/>
-          <w:color w:val="0E121D"/>
-        </w:rPr>
-        <w:t xml:space="preserve"/>
-        <w:tab/>
-        <w:t xml:space="preserve">•</w:t>
-        <w:tab/>
-        <w:t xml:space="preserve"/>
-      </w:r>
-      <w:r>
-        <w:rPr>
-          <w:rFonts w:ascii="Helvetica Neue" w:hAnsi="Helvetica Neue" w:cs="Helvetica Neue"/>
-          <w:sz w:val="29"/>
-          <w:sz-cs w:val="29"/>
-          <w:spacing w:val="0"/>
-          <w:color w:val="0E121D"/>
-        </w:rPr>
-        <w:t xml:space="preserve">Pro: €15 / month (≈ $17.84 USD) (3,000 documents / month)</w:t>
-      </w:r>
-    </w:p>
-    <w:p>
-      <w:pPr>
-        <w:ind w:left="720" w:first-line="-720"/>
-        <w:spacing w:after="80"/>
-      </w:pPr>
-      <w:r>
-        <w:rPr>
-          <w:rFonts w:ascii="Helvetica Neue" w:hAnsi="Helvetica Neue" w:cs="Helvetica Neue"/>
-          <w:sz w:val="29"/>
-          <w:sz-cs w:val="29"/>
-          <w:color w:val="0E121D"/>
-        </w:rPr>
-        <w:t xml:space="preserve"/>
-        <w:tab/>
-        <w:t xml:space="preserve">•</w:t>
-        <w:tab/>
-        <w:t xml:space="preserve"/>
-      </w:r>
-      <w:r>
-        <w:rPr>
-          <w:rFonts w:ascii="Helvetica Neue" w:hAnsi="Helvetica Neue" w:cs="Helvetica Neue"/>
-          <w:sz w:val="29"/>
-          <w:sz-cs w:val="29"/>
-          <w:spacing w:val="0"/>
-          <w:color w:val="0E121D"/>
-        </w:rPr>
-        <w:t xml:space="preserve">Pro+: €60 / month (≈ $71.37 USD) (5,000 documents / month)</w:t>
-      </w:r>
-    </w:p>
-    <w:p>
-      <w:pPr>
-        <w:ind w:left="720" w:first-line="-720"/>
-        <w:spacing w:after="80"/>
-      </w:pPr>
-      <w:r>
-        <w:rPr>
-          <w:rFonts w:ascii="Helvetica Neue" w:hAnsi="Helvetica Neue" w:cs="Helvetica Neue"/>
-          <w:sz w:val="29"/>
-          <w:sz-cs w:val="29"/>
-          <w:color w:val="0E121D"/>
-        </w:rPr>
-        <w:t xml:space="preserve"/>
-        <w:tab/>
-        <w:t xml:space="preserve">•</w:t>
-        <w:tab/>
-        <w:t xml:space="preserve"/>
-      </w:r>
-      <w:r>
-        <w:rPr>
-          <w:rFonts w:ascii="Helvetica Neue" w:hAnsi="Helvetica Neue" w:cs="Helvetica Neue"/>
-          <w:sz w:val="29"/>
-          <w:sz-cs w:val="29"/>
-          <w:spacing w:val="0"/>
-          <w:color w:val="0E121D"/>
-        </w:rPr>
-        <w:t xml:space="preserve">Premium: €300 / month (≈ $356.86 USD) (60,000 documents / month)</w:t>
+        <w:t xml:space="preserve">Free: $0 / month (20 documents / month)</w:t>
+      </w:r>
+    </w:p>
+    <w:p>
+      <w:pPr>
+        <w:ind w:left="720" w:first-line="-720"/>
+        <w:spacing w:after="80"/>
+      </w:pPr>
+      <w:r>
+        <w:rPr>
+          <w:rFonts w:ascii="Helvetica Neue" w:hAnsi="Helvetica Neue" w:cs="Helvetica Neue"/>
+          <w:sz w:val="29"/>
+          <w:sz-cs w:val="29"/>
+          <w:color w:val="0E121D"/>
+        </w:rPr>
+        <w:t xml:space="preserve"/>
+        <w:tab/>
+        <w:t xml:space="preserve">•</w:t>
+        <w:tab/>
+        <w:t xml:space="preserve"/>
+      </w:r>
+      <w:r>
+        <w:rPr>
+          <w:rFonts w:ascii="Helvetica Neue" w:hAnsi="Helvetica Neue" w:cs="Helvetica Neue"/>
+          <w:sz w:val="29"/>
+          <w:sz-cs w:val="29"/>
+          <w:spacing w:val="0"/>
+          <w:color w:val="0E121D"/>
+        </w:rPr>
+        <w:t xml:space="preserve">Starter: €5 / month (≈ $5.77 USD) (300 documents / month)</w:t>
+      </w:r>
+    </w:p>
+    <w:p>
+      <w:pPr>
+        <w:ind w:left="720" w:first-line="-720"/>
+        <w:spacing w:after="80"/>
+      </w:pPr>
+      <w:r>
+        <w:rPr>
+          <w:rFonts w:ascii="Helvetica Neue" w:hAnsi="Helvetica Neue" w:cs="Helvetica Neue"/>
+          <w:sz w:val="29"/>
+          <w:sz-cs w:val="29"/>
+          <w:color w:val="0E121D"/>
+        </w:rPr>
+        <w:t xml:space="preserve"/>
+        <w:tab/>
+        <w:t xml:space="preserve">•</w:t>
+        <w:tab/>
+        <w:t xml:space="preserve"/>
+      </w:r>
+      <w:r>
+        <w:rPr>
+          <w:rFonts w:ascii="Helvetica Neue" w:hAnsi="Helvetica Neue" w:cs="Helvetica Neue"/>
+          <w:sz w:val="29"/>
+          <w:sz-cs w:val="29"/>
+          <w:spacing w:val="0"/>
+          <w:color w:val="0E121D"/>
+        </w:rPr>
+        <w:t xml:space="preserve">Pro: €15 / month (≈ $17.30 USD) (3,000 documents / month)</w:t>
+      </w:r>
+    </w:p>
+    <w:p>
+      <w:pPr>
+        <w:ind w:left="720" w:first-line="-720"/>
+        <w:spacing w:after="80"/>
+      </w:pPr>
+      <w:r>
+        <w:rPr>
+          <w:rFonts w:ascii="Helvetica Neue" w:hAnsi="Helvetica Neue" w:cs="Helvetica Neue"/>
+          <w:sz w:val="29"/>
+          <w:sz-cs w:val="29"/>
+          <w:color w:val="0E121D"/>
+        </w:rPr>
+        <w:t xml:space="preserve"/>
+        <w:tab/>
+        <w:t xml:space="preserve">•</w:t>
+        <w:tab/>
+        <w:t xml:space="preserve"/>
+      </w:r>
+      <w:r>
+        <w:rPr>
+          <w:rFonts w:ascii="Helvetica Neue" w:hAnsi="Helvetica Neue" w:cs="Helvetica Neue"/>
+          <w:sz w:val="29"/>
+          <w:sz-cs w:val="29"/>
+          <w:spacing w:val="0"/>
+          <w:color w:val="0E121D"/>
+        </w:rPr>
+        <w:t xml:space="preserve">Pro+: €60 / month (≈ $69.19 USD) (5,000 documents / month)</w:t>
       </w:r>
     </w:p>
     <w:p>
@@ -2223,7 +2223,7 @@
           <w:spacing w:val="0"/>
           <w:color w:val="3B4350"/>
         </w:rPr>
-        <w:t xml:space="preserve">EU pricing shown; vendor also offers annual billing discounts and free trial options. </w:t>
+        <w:t xml:space="preserve">EU pricing shown; Premium (€300 / month for 60,000 documents) is available if higher volume is required. Starter is the practical launch tier.</w:t>
       </w:r>
     </w:p>
     <w:p>
@@ -2260,152 +2260,152 @@
           <w:spacing w:val="0"/>
           <w:color w:val="0E121D"/>
         </w:rPr>
-        <w:t xml:space="preserve">Vehicle image uploads, storage, and delivery</w:t>
-      </w:r>
-    </w:p>
-    <w:p>
-      <w:pPr>
-        <w:ind w:left="720" w:first-line="-720"/>
-        <w:spacing w:after="80"/>
-      </w:pPr>
-      <w:r>
-        <w:rPr>
-          <w:rFonts w:ascii="Helvetica Neue" w:hAnsi="Helvetica Neue" w:cs="Helvetica Neue"/>
-          <w:sz w:val="29"/>
-          <w:sz-cs w:val="29"/>
-          <w:color w:val="0E121D"/>
-        </w:rPr>
-        <w:t xml:space="preserve"/>
-        <w:tab/>
-        <w:t xml:space="preserve">•</w:t>
-        <w:tab/>
-        <w:t xml:space="preserve"/>
-      </w:r>
-      <w:r>
-        <w:rPr>
-          <w:rFonts w:ascii="Helvetica Neue" w:hAnsi="Helvetica Neue" w:cs="Helvetica Neue"/>
-          <w:sz w:val="29"/>
-          <w:sz-cs w:val="29"/>
-          <w:spacing w:val="0"/>
-          <w:color w:val="0E121D"/>
-        </w:rPr>
-        <w:t xml:space="preserve">Trial: $0 / month (3 GB storage + 3 GB bandwidth)</w:t>
-      </w:r>
-    </w:p>
-    <w:p>
-      <w:pPr>
-        <w:ind w:left="720" w:first-line="-720"/>
-        <w:spacing w:after="80"/>
-      </w:pPr>
-      <w:r>
-        <w:rPr>
-          <w:rFonts w:ascii="Helvetica Neue" w:hAnsi="Helvetica Neue" w:cs="Helvetica Neue"/>
-          <w:sz w:val="29"/>
-          <w:sz-cs w:val="29"/>
-          <w:color w:val="0E121D"/>
-        </w:rPr>
-        <w:t xml:space="preserve"/>
-        <w:tab/>
-        <w:t xml:space="preserve">•</w:t>
-        <w:tab/>
-        <w:t xml:space="preserve"/>
-      </w:r>
-      <w:r>
-        <w:rPr>
-          <w:rFonts w:ascii="Helvetica Neue" w:hAnsi="Helvetica Neue" w:cs="Helvetica Neue"/>
-          <w:sz w:val="29"/>
-          <w:sz-cs w:val="29"/>
-          <w:spacing w:val="0"/>
-          <w:color w:val="0E121D"/>
-        </w:rPr>
-        <w:t xml:space="preserve">Pay as you go: $25 / month (150 GB storage + 150 GB bandwidth)</w:t>
-      </w:r>
-    </w:p>
-    <w:p>
-      <w:pPr>
-        <w:ind w:left="720" w:first-line="-720"/>
-        <w:spacing w:after="80"/>
-      </w:pPr>
-      <w:r>
-        <w:rPr>
-          <w:rFonts w:ascii="Helvetica Neue" w:hAnsi="Helvetica Neue" w:cs="Helvetica Neue"/>
-          <w:sz w:val="29"/>
-          <w:sz-cs w:val="29"/>
-          <w:color w:val="0E121D"/>
-        </w:rPr>
-        <w:t xml:space="preserve"/>
-        <w:tab/>
-        <w:t xml:space="preserve">•</w:t>
-        <w:tab/>
-        <w:t xml:space="preserve"/>
-      </w:r>
-      <w:r>
-        <w:rPr>
-          <w:rFonts w:ascii="Helvetica Neue" w:hAnsi="Helvetica Neue" w:cs="Helvetica Neue"/>
-          <w:sz w:val="29"/>
-          <w:sz-cs w:val="29"/>
-          <w:spacing w:val="0"/>
-          <w:color w:val="0E121D"/>
-        </w:rPr>
-        <w:t xml:space="preserve">Startups: $49 / month (300 GB storage + 300 GB bandwidth)</w:t>
-      </w:r>
-    </w:p>
-    <w:p>
-      <w:pPr>
-        <w:ind w:left="720" w:first-line="-720"/>
-        <w:spacing w:after="80"/>
-      </w:pPr>
-      <w:r>
-        <w:rPr>
-          <w:rFonts w:ascii="Helvetica Neue" w:hAnsi="Helvetica Neue" w:cs="Helvetica Neue"/>
-          <w:sz w:val="29"/>
-          <w:sz-cs w:val="29"/>
-          <w:color w:val="0E121D"/>
-        </w:rPr>
-        <w:t xml:space="preserve"/>
-        <w:tab/>
-        <w:t xml:space="preserve">•</w:t>
-        <w:tab/>
-        <w:t xml:space="preserve"/>
-      </w:r>
-      <w:r>
-        <w:rPr>
-          <w:rFonts w:ascii="Helvetica Neue" w:hAnsi="Helvetica Neue" w:cs="Helvetica Neue"/>
-          <w:sz w:val="29"/>
-          <w:sz-cs w:val="29"/>
-          <w:spacing w:val="0"/>
-          <w:color w:val="0E121D"/>
-        </w:rPr>
-        <w:t xml:space="preserve">Business: $239 / month (1 TB storage + 1 TB bandwidth)</w:t>
-      </w:r>
-    </w:p>
-    <w:p>
-      <w:pPr>
-        <w:ind w:left="720" w:first-line="-720"/>
-        <w:spacing w:after="80"/>
-      </w:pPr>
-      <w:r>
-        <w:rPr>
-          <w:rFonts w:ascii="Helvetica Neue" w:hAnsi="Helvetica Neue" w:cs="Helvetica Neue"/>
-          <w:sz w:val="29"/>
-          <w:sz-cs w:val="29"/>
-          <w:color w:val="0E121D"/>
-        </w:rPr>
-        <w:t xml:space="preserve"/>
-        <w:tab/>
-        <w:t xml:space="preserve">•</w:t>
-        <w:tab/>
-        <w:t xml:space="preserve"/>
-      </w:r>
-      <w:r>
-        <w:rPr>
-          <w:rFonts w:ascii="Helvetica Neue" w:hAnsi="Helvetica Neue" w:cs="Helvetica Neue"/>
-          <w:sz w:val="29"/>
-          <w:sz-cs w:val="29"/>
-          <w:spacing w:val="0"/>
-          <w:color w:val="0E121D"/>
-        </w:rPr>
-        <w:t xml:space="preserve">Overages: storage $0.05/GB, bandwidth $0.22/GB, uploads $0.05/1,000, transformations $0.15/1,000</w:t>
+        <w:t xml:space="preserve">Optional image/document uploads when enabled</w:t>
+      </w:r>
+    </w:p>
+    <w:p>
+      <w:pPr>
+        <w:ind w:left="720" w:first-line="-720"/>
+        <w:spacing w:after="80"/>
+      </w:pPr>
+      <w:r>
+        <w:rPr>
+          <w:rFonts w:ascii="Helvetica Neue" w:hAnsi="Helvetica Neue" w:cs="Helvetica Neue"/>
+          <w:sz w:val="29"/>
+          <w:sz-cs w:val="29"/>
+          <w:color w:val="0E121D"/>
+        </w:rPr>
+        <w:t xml:space="preserve"/>
+        <w:tab/>
+        <w:t xml:space="preserve">•</w:t>
+        <w:tab/>
+        <w:t xml:space="preserve"/>
+      </w:r>
+      <w:r>
+        <w:rPr>
+          <w:rFonts w:ascii="Helvetica Neue" w:hAnsi="Helvetica Neue" w:cs="Helvetica Neue"/>
+          <w:sz w:val="29"/>
+          <w:sz-cs w:val="29"/>
+          <w:spacing w:val="0"/>
+          <w:color w:val="0E121D"/>
+        </w:rPr>
+        <w:t xml:space="preserve">Free: $0 / month (1,000 operations / month, 5 GB)</w:t>
+      </w:r>
+    </w:p>
+    <w:p>
+      <w:pPr>
+        <w:ind w:left="720" w:first-line="-720"/>
+        <w:spacing w:after="80"/>
+      </w:pPr>
+      <w:r>
+        <w:rPr>
+          <w:rFonts w:ascii="Helvetica Neue" w:hAnsi="Helvetica Neue" w:cs="Helvetica Neue"/>
+          <w:sz w:val="29"/>
+          <w:sz-cs w:val="29"/>
+          <w:color w:val="0E121D"/>
+        </w:rPr>
+        <w:t xml:space="preserve"/>
+        <w:tab/>
+        <w:t xml:space="preserve">•</w:t>
+        <w:tab/>
+        <w:t xml:space="preserve"/>
+      </w:r>
+      <w:r>
+        <w:rPr>
+          <w:rFonts w:ascii="Helvetica Neue" w:hAnsi="Helvetica Neue" w:cs="Helvetica Neue"/>
+          <w:sz w:val="29"/>
+          <w:sz-cs w:val="29"/>
+          <w:spacing w:val="0"/>
+          <w:color w:val="0E121D"/>
+        </w:rPr>
+        <w:t xml:space="preserve">Pro: $66 / month (100,000 operations / month)</w:t>
+      </w:r>
+    </w:p>
+    <w:p>
+      <w:pPr>
+        <w:ind w:left="720" w:first-line="-720"/>
+        <w:spacing w:after="80"/>
+      </w:pPr>
+      <w:r>
+        <w:rPr>
+          <w:rFonts w:ascii="Helvetica Neue" w:hAnsi="Helvetica Neue" w:cs="Helvetica Neue"/>
+          <w:sz w:val="29"/>
+          <w:sz-cs w:val="29"/>
+          <w:color w:val="0E121D"/>
+        </w:rPr>
+        <w:t xml:space="preserve"/>
+        <w:tab/>
+        <w:t xml:space="preserve">•</w:t>
+        <w:tab/>
+        <w:t xml:space="preserve"/>
+      </w:r>
+      <w:r>
+        <w:rPr>
+          <w:rFonts w:ascii="Helvetica Neue" w:hAnsi="Helvetica Neue" w:cs="Helvetica Neue"/>
+          <w:sz w:val="29"/>
+          <w:sz-cs w:val="29"/>
+          <w:spacing w:val="0"/>
+          <w:color w:val="0E121D"/>
+        </w:rPr>
+        <w:t xml:space="preserve">Enterprise: Custom</w:t>
+      </w:r>
+    </w:p>
+    <w:p>
+      <w:pPr>
+        <w:ind w:left="720" w:first-line="-720"/>
+        <w:spacing w:after="80"/>
+      </w:pPr>
+      <w:r>
+        <w:rPr>
+          <w:rFonts w:ascii="Helvetica Neue" w:hAnsi="Helvetica Neue" w:cs="Helvetica Neue"/>
+          <w:sz w:val="29"/>
+          <w:sz-cs w:val="29"/>
+          <w:color w:val="0E121D"/>
+        </w:rPr>
+        <w:t xml:space="preserve"/>
+        <w:tab/>
+        <w:t xml:space="preserve">•</w:t>
+        <w:tab/>
+        <w:t xml:space="preserve"/>
+      </w:r>
+      <w:r>
+        <w:rPr>
+          <w:rFonts w:ascii="Helvetica Neue" w:hAnsi="Helvetica Neue" w:cs="Helvetica Neue"/>
+          <w:sz w:val="29"/>
+          <w:sz-cs w:val="29"/>
+          <w:spacing w:val="0"/>
+          <w:color w:val="0E121D"/>
+        </w:rPr>
+        <w:t xml:space="preserve">Higher-volume plans are available on request.</w:t>
+      </w:r>
+    </w:p>
+    <w:p>
+      <w:pPr>
+        <w:ind w:left="720" w:first-line="-720"/>
+        <w:spacing w:after="80"/>
+      </w:pPr>
+      <w:r>
+        <w:rPr>
+          <w:rFonts w:ascii="Helvetica Neue" w:hAnsi="Helvetica Neue" w:cs="Helvetica Neue"/>
+          <w:sz w:val="29"/>
+          <w:sz-cs w:val="29"/>
+          <w:color w:val="0E121D"/>
+        </w:rPr>
+        <w:t xml:space="preserve"/>
+        <w:tab/>
+        <w:t xml:space="preserve">•</w:t>
+        <w:tab/>
+        <w:t xml:space="preserve"/>
+      </w:r>
+      <w:r>
+        <w:rPr>
+          <w:rFonts w:ascii="Helvetica Neue" w:hAnsi="Helvetica Neue" w:cs="Helvetica Neue"/>
+          <w:sz w:val="29"/>
+          <w:sz-cs w:val="29"/>
+          <w:spacing w:val="0"/>
+          <w:color w:val="0E121D"/>
+        </w:rPr>
+        <w:t xml:space="preserve">The current free tier is positioned for personal use only.</w:t>
       </w:r>
     </w:p>
     <w:p>
@@ -2418,7 +2418,7 @@
           <w:spacing w:val="0"/>
           <w:color w:val="3B4350"/>
         </w:rPr>
-        <w:t xml:space="preserve">Offloads image storage/optimization; cost depends mainly on storage + bandwidth.</w:t>
+        <w:t xml:space="preserve">Useful if you want managed uploads, but it can stay deferred for launch if those flows remain disabled.</w:t>
       </w:r>
     </w:p>
     <w:p>
@@ -2584,7 +2584,7 @@
           <w:spacing w:val="0"/>
           <w:color w:val="3B4350"/>
         </w:rPr>
-        <w:t xml:space="preserve">For planning, this proposal includes an estimated </w:t>
+        <w:t xml:space="preserve">For planning, assume published Jamaica rates as a guide only and confirm the final live merchant terms during onboarding. This proposal previously used an estimated </w:t>
       </w:r>
       <w:r>
         <w:rPr>
@@ -2605,7 +2605,7 @@
           <w:spacing w:val="0"/>
           <w:color w:val="3B4350"/>
         </w:rPr>
-        <w:t xml:space="preserve"> processing rate (confirm final terms with WiPay). </w:t>
+        <w:t xml:space="preserve"> processing rate; for the current launch plan, WiPay can remain deferred until public online payments are re-enabled. </w:t>
       </w:r>
     </w:p>
     <w:p>
@@ -2636,7 +2636,7 @@
           <w:spacing w:val="0"/>
           <w:color w:val="3B4350"/>
         </w:rPr>
-        <w:t xml:space="preserve">The items below reflect third-party/vendor costs and an allowance for miscellaneous expenses. WiPay processing is a variable percentage of each successful transaction. Vendor billing may be in USD/EUR and may also include taxes. </w:t>
+        <w:t xml:space="preserve">The items below reflect third-party/vendor costs and an allowance for miscellaneous expenses. Variable spend now depends mainly on database usage, optional uploads, and whether online payments are enabled. Vendor billing may be in USD/EUR and may also include taxes. </w:t>
       </w:r>
     </w:p>
     <w:p>
@@ -2729,133 +2729,133 @@
           <w:spacing w:val="0"/>
           <w:color w:val="3B4350"/>
         </w:rPr>
-        <w:t xml:space="preserve">Minimum viable</w:t>
-      </w:r>
-      <w:r>
-        <w:rPr>
-          <w:rFonts w:ascii="Helvetica Neue" w:hAnsi="Helvetica Neue" w:cs="Helvetica Neue"/>
-          <w:sz w:val="29"/>
-          <w:sz-cs w:val="29"/>
-          <w:spacing w:val="0"/>
-          <w:color w:val="0E121D"/>
-        </w:rPr>
-        <w:t xml:space="preserve"/>
-      </w:r>
-    </w:p>
-    <w:p>
-      <w:pPr>
-        <w:ind w:left="720" w:first-line="-720"/>
-        <w:spacing w:after="80"/>
-      </w:pPr>
-      <w:r>
-        <w:rPr>
-          <w:rFonts w:ascii="Helvetica Neue" w:hAnsi="Helvetica Neue" w:cs="Helvetica Neue"/>
-          <w:sz w:val="29"/>
-          <w:sz-cs w:val="29"/>
-          <w:color w:val="0E121D"/>
-        </w:rPr>
-        <w:t xml:space="preserve"/>
-        <w:tab/>
-        <w:t xml:space="preserve">•</w:t>
-        <w:tab/>
-        <w:t xml:space="preserve"/>
-      </w:r>
-      <w:r>
-        <w:rPr>
-          <w:rFonts w:ascii="Helvetica Neue" w:hAnsi="Helvetica Neue" w:cs="Helvetica Neue"/>
-          <w:sz w:val="29"/>
-          <w:sz-cs w:val="29"/>
-          <w:spacing w:val="0"/>
-          <w:color w:val="0E121D"/>
-        </w:rPr>
-        <w:t xml:space="preserve">Netlify: 1st paid tier (Personal) – $9/mo</w:t>
-      </w:r>
-    </w:p>
-    <w:p>
-      <w:pPr>
-        <w:ind w:left="720" w:first-line="-720"/>
-        <w:spacing w:after="80"/>
-      </w:pPr>
-      <w:r>
-        <w:rPr>
-          <w:rFonts w:ascii="Helvetica Neue" w:hAnsi="Helvetica Neue" w:cs="Helvetica Neue"/>
-          <w:sz w:val="29"/>
-          <w:sz-cs w:val="29"/>
-          <w:color w:val="0E121D"/>
-        </w:rPr>
-        <w:t xml:space="preserve"/>
-        <w:tab/>
-        <w:t xml:space="preserve">•</w:t>
-        <w:tab/>
-        <w:t xml:space="preserve"/>
-      </w:r>
-      <w:r>
-        <w:rPr>
-          <w:rFonts w:ascii="Helvetica Neue" w:hAnsi="Helvetica Neue" w:cs="Helvetica Neue"/>
-          <w:sz w:val="29"/>
-          <w:sz-cs w:val="29"/>
-          <w:spacing w:val="0"/>
-          <w:color w:val="0E121D"/>
-        </w:rPr>
-        <w:t xml:space="preserve">PDFMonkey: 1st paid tier (Starter) – €5/mo (≈ $5.95 USD)</w:t>
-      </w:r>
-    </w:p>
-    <w:p>
-      <w:pPr>
-        <w:ind w:left="720" w:first-line="-720"/>
-        <w:spacing w:after="80"/>
-      </w:pPr>
-      <w:r>
-        <w:rPr>
-          <w:rFonts w:ascii="Helvetica Neue" w:hAnsi="Helvetica Neue" w:cs="Helvetica Neue"/>
-          <w:sz w:val="29"/>
-          <w:sz-cs w:val="29"/>
-          <w:color w:val="0E121D"/>
-        </w:rPr>
-        <w:t xml:space="preserve"/>
-        <w:tab/>
-        <w:t xml:space="preserve">•</w:t>
-        <w:tab/>
-        <w:t xml:space="preserve"/>
-      </w:r>
-      <w:r>
-        <w:rPr>
-          <w:rFonts w:ascii="Helvetica Neue" w:hAnsi="Helvetica Neue" w:cs="Helvetica Neue"/>
-          <w:sz w:val="29"/>
-          <w:sz-cs w:val="29"/>
-          <w:spacing w:val="0"/>
-          <w:color w:val="0E121D"/>
-        </w:rPr>
-        <w:t xml:space="preserve">WiPay processing – estimated 4.5%</w:t>
-      </w:r>
-    </w:p>
-    <w:p>
-      <w:pPr>
-        <w:ind w:left="720" w:first-line="-720"/>
-        <w:spacing w:after="80"/>
-      </w:pPr>
-      <w:r>
-        <w:rPr>
-          <w:rFonts w:ascii="Helvetica Neue" w:hAnsi="Helvetica Neue" w:cs="Helvetica Neue"/>
-          <w:sz w:val="29"/>
-          <w:sz-cs w:val="29"/>
-          <w:color w:val="0E121D"/>
-        </w:rPr>
-        <w:t xml:space="preserve"/>
-        <w:tab/>
-        <w:t xml:space="preserve">•</w:t>
-        <w:tab/>
-        <w:t xml:space="preserve"/>
-      </w:r>
-      <w:r>
-        <w:rPr>
-          <w:rFonts w:ascii="Helvetica Neue" w:hAnsi="Helvetica Neue" w:cs="Helvetica Neue"/>
-          <w:sz w:val="29"/>
-          <w:sz-cs w:val="29"/>
-          <w:spacing w:val="0"/>
-          <w:color w:val="0E121D"/>
-        </w:rPr>
-        <w:t xml:space="preserve">Miscellaneous allowance – $50/mo</w:t>
+        <w:t xml:space="preserve">Launch with payments deferred</w:t>
+      </w:r>
+      <w:r>
+        <w:rPr>
+          <w:rFonts w:ascii="Helvetica Neue" w:hAnsi="Helvetica Neue" w:cs="Helvetica Neue"/>
+          <w:sz w:val="29"/>
+          <w:sz-cs w:val="29"/>
+          <w:spacing w:val="0"/>
+          <w:color w:val="0E121D"/>
+        </w:rPr>
+        <w:t xml:space="preserve"/>
+      </w:r>
+    </w:p>
+    <w:p>
+      <w:pPr>
+        <w:ind w:left="720" w:first-line="-720"/>
+        <w:spacing w:after="80"/>
+      </w:pPr>
+      <w:r>
+        <w:rPr>
+          <w:rFonts w:ascii="Helvetica Neue" w:hAnsi="Helvetica Neue" w:cs="Helvetica Neue"/>
+          <w:sz w:val="29"/>
+          <w:sz-cs w:val="29"/>
+          <w:color w:val="0E121D"/>
+        </w:rPr>
+        <w:t xml:space="preserve"/>
+        <w:tab/>
+        <w:t xml:space="preserve">•</w:t>
+        <w:tab/>
+        <w:t xml:space="preserve"/>
+      </w:r>
+      <w:r>
+        <w:rPr>
+          <w:rFonts w:ascii="Helvetica Neue" w:hAnsi="Helvetica Neue" w:cs="Helvetica Neue"/>
+          <w:sz w:val="29"/>
+          <w:sz-cs w:val="29"/>
+          <w:spacing w:val="0"/>
+          <w:color w:val="0E121D"/>
+        </w:rPr>
+        <w:t xml:space="preserve">Netlify: Free tier – $0/mo</w:t>
+      </w:r>
+    </w:p>
+    <w:p>
+      <w:pPr>
+        <w:ind w:left="720" w:first-line="-720"/>
+        <w:spacing w:after="80"/>
+      </w:pPr>
+      <w:r>
+        <w:rPr>
+          <w:rFonts w:ascii="Helvetica Neue" w:hAnsi="Helvetica Neue" w:cs="Helvetica Neue"/>
+          <w:sz w:val="29"/>
+          <w:sz-cs w:val="29"/>
+          <w:color w:val="0E121D"/>
+        </w:rPr>
+        <w:t xml:space="preserve"/>
+        <w:tab/>
+        <w:t xml:space="preserve">•</w:t>
+        <w:tab/>
+        <w:t xml:space="preserve"/>
+      </w:r>
+      <w:r>
+        <w:rPr>
+          <w:rFonts w:ascii="Helvetica Neue" w:hAnsi="Helvetica Neue" w:cs="Helvetica Neue"/>
+          <w:sz w:val="29"/>
+          <w:sz-cs w:val="29"/>
+          <w:spacing w:val="0"/>
+          <w:color w:val="0E121D"/>
+        </w:rPr>
+        <w:t xml:space="preserve">Neon + Resend: free tiers – $0/mo initially</w:t>
+      </w:r>
+    </w:p>
+    <w:p>
+      <w:pPr>
+        <w:ind w:left="720" w:first-line="-720"/>
+        <w:spacing w:after="80"/>
+      </w:pPr>
+      <w:r>
+        <w:rPr>
+          <w:rFonts w:ascii="Helvetica Neue" w:hAnsi="Helvetica Neue" w:cs="Helvetica Neue"/>
+          <w:sz w:val="29"/>
+          <w:sz-cs w:val="29"/>
+          <w:color w:val="0E121D"/>
+        </w:rPr>
+        <w:t xml:space="preserve"/>
+        <w:tab/>
+        <w:t xml:space="preserve">•</w:t>
+        <w:tab/>
+        <w:t xml:space="preserve"/>
+      </w:r>
+      <w:r>
+        <w:rPr>
+          <w:rFonts w:ascii="Helvetica Neue" w:hAnsi="Helvetica Neue" w:cs="Helvetica Neue"/>
+          <w:sz w:val="29"/>
+          <w:sz-cs w:val="29"/>
+          <w:spacing w:val="0"/>
+          <w:color w:val="0E121D"/>
+        </w:rPr>
+        <w:t xml:space="preserve">PDFMonkey: Starter – €5/mo (≈ $5.77 USD)</w:t>
+      </w:r>
+    </w:p>
+    <w:p>
+      <w:pPr>
+        <w:ind w:left="720" w:first-line="-720"/>
+        <w:spacing w:after="80"/>
+      </w:pPr>
+      <w:r>
+        <w:rPr>
+          <w:rFonts w:ascii="Helvetica Neue" w:hAnsi="Helvetica Neue" w:cs="Helvetica Neue"/>
+          <w:sz w:val="29"/>
+          <w:sz-cs w:val="29"/>
+          <w:color w:val="0E121D"/>
+        </w:rPr>
+        <w:t xml:space="preserve"/>
+        <w:tab/>
+        <w:t xml:space="preserve">•</w:t>
+        <w:tab/>
+        <w:t xml:space="preserve"/>
+      </w:r>
+      <w:r>
+        <w:rPr>
+          <w:rFonts w:ascii="Helvetica Neue" w:hAnsi="Helvetica Neue" w:cs="Helvetica Neue"/>
+          <w:sz w:val="29"/>
+          <w:sz-cs w:val="29"/>
+          <w:spacing w:val="0"/>
+          <w:color w:val="0E121D"/>
+        </w:rPr>
+        <w:t xml:space="preserve">Miscellaneous allowance – $25/mo</w:t>
       </w:r>
     </w:p>
     <w:p>
@@ -2871,7 +2871,7 @@
           <w:spacing w:val="0"/>
           <w:color w:val="0E121D"/>
         </w:rPr>
-        <w:t xml:space="preserve">$59.00/mo</w:t>
+        <w:t xml:space="preserve">$25.00/mo</w:t>
       </w:r>
       <w:r>
         <w:rPr>
@@ -2913,7 +2913,7 @@
           <w:spacing w:val="0"/>
           <w:color w:val="0E121D"/>
         </w:rPr>
-        <w:t xml:space="preserve">$5.95/mo</w:t>
+        <w:t xml:space="preserve">$30.77/mo</w:t>
       </w:r>
       <w:r>
         <w:rPr>
@@ -2960,7 +2960,7 @@
           <w:spacing w:val="0"/>
           <w:color w:val="0E121D"/>
         </w:rPr>
-        <w:t xml:space="preserve">$64.95/mo</w:t>
+        <w:t xml:space="preserve">$30.77/mo</w:t>
       </w:r>
       <w:r>
         <w:rPr>
@@ -2981,7 +2981,7 @@
           <w:spacing w:val="0"/>
           <w:color w:val="0E121D"/>
         </w:rPr>
-        <w:t xml:space="preserve">JMD 10,144.77/mo</w:t>
+        <w:t xml:space="preserve">JMD 4,817.84/mo</w:t>
       </w:r>
       <w:r>
         <w:rPr>
@@ -3006,7 +3006,7 @@
           <w:spacing w:val="0"/>
           <w:color w:val="3B4350"/>
         </w:rPr>
-        <w:t xml:space="preserve">(excludes WiPay variable fees)</w:t>
+        <w:t xml:space="preserve">(excludes database usage if free-tier limits are exceeded)</w:t>
       </w:r>
     </w:p>
     <w:p>
@@ -3019,7 +3019,7 @@
           <w:spacing w:val="0"/>
           <w:color w:val="3B4350"/>
         </w:rPr>
-        <w:t xml:space="preserve">WiPay: ~4.5% of online payments processed</w:t>
+        <w:t xml:space="preserve">Database usage only after free-tier limits; no WiPay processing while online payments remain disabled</w:t>
       </w:r>
     </w:p>
     <w:p>
@@ -3056,7 +3056,7 @@
           <w:spacing w:val="0"/>
           <w:color w:val="3B4350"/>
         </w:rPr>
-        <w:t xml:space="preserve">All services baseline</w:t>
+        <w:t xml:space="preserve">Online payments + uploads enabled</w:t>
       </w:r>
       <w:r>
         <w:rPr>
@@ -3153,36 +3153,36 @@
           <w:spacing w:val="0"/>
           <w:color w:val="0E121D"/>
         </w:rPr>
-        <w:t xml:space="preserve">Uploadcare: 1st paid tier (Pay as you go) – $25/mo</w:t>
-      </w:r>
-    </w:p>
-    <w:p>
-      <w:pPr>
-        <w:ind w:left="720" w:first-line="-720"/>
-        <w:spacing w:after="80"/>
-      </w:pPr>
-      <w:r>
-        <w:rPr>
-          <w:rFonts w:ascii="Helvetica Neue" w:hAnsi="Helvetica Neue" w:cs="Helvetica Neue"/>
-          <w:sz w:val="29"/>
-          <w:sz-cs w:val="29"/>
-          <w:color w:val="0E121D"/>
-        </w:rPr>
-        <w:t xml:space="preserve"/>
-        <w:tab/>
-        <w:t xml:space="preserve">•</w:t>
-        <w:tab/>
-        <w:t xml:space="preserve"/>
-      </w:r>
-      <w:r>
-        <w:rPr>
-          <w:rFonts w:ascii="Helvetica Neue" w:hAnsi="Helvetica Neue" w:cs="Helvetica Neue"/>
-          <w:sz w:val="29"/>
-          <w:sz-cs w:val="29"/>
-          <w:spacing w:val="0"/>
-          <w:color w:val="0E121D"/>
-        </w:rPr>
-        <w:t xml:space="preserve">Resend: Free tier ($0, up to 3,000 emails/mo) </w:t>
+        <w:t xml:space="preserve">Uploadcare: Pro – $66/mo (production apps / websites)</w:t>
+      </w:r>
+    </w:p>
+    <w:p>
+      <w:pPr>
+        <w:ind w:left="720" w:first-line="-720"/>
+        <w:spacing w:after="80"/>
+      </w:pPr>
+      <w:r>
+        <w:rPr>
+          <w:rFonts w:ascii="Helvetica Neue" w:hAnsi="Helvetica Neue" w:cs="Helvetica Neue"/>
+          <w:sz w:val="29"/>
+          <w:sz-cs w:val="29"/>
+          <w:color w:val="0E121D"/>
+        </w:rPr>
+        <w:t xml:space="preserve"/>
+        <w:tab/>
+        <w:t xml:space="preserve">•</w:t>
+        <w:tab/>
+        <w:t xml:space="preserve"/>
+      </w:r>
+      <w:r>
+        <w:rPr>
+          <w:rFonts w:ascii="Helvetica Neue" w:hAnsi="Helvetica Neue" w:cs="Helvetica Neue"/>
+          <w:sz w:val="29"/>
+          <w:sz-cs w:val="29"/>
+          <w:spacing w:val="0"/>
+          <w:color w:val="0E121D"/>
+        </w:rPr>
+        <w:t xml:space="preserve">Resend: Free tier ($0, up to 3,000 emails/mo, 100 / day) </w:t>
       </w:r>
       <w:r>
         <w:rPr>
@@ -3231,65 +3231,65 @@
           <w:spacing w:val="0"/>
           <w:color w:val="0E121D"/>
         </w:rPr>
-        <w:t xml:space="preserve">PDFMonkey: 1st paid tier (Starter) – €5/mo (≈ $5.95 USD)</w:t>
-      </w:r>
-    </w:p>
-    <w:p>
-      <w:pPr>
-        <w:ind w:left="720" w:first-line="-720"/>
-        <w:spacing w:after="80"/>
-      </w:pPr>
-      <w:r>
-        <w:rPr>
-          <w:rFonts w:ascii="Helvetica Neue" w:hAnsi="Helvetica Neue" w:cs="Helvetica Neue"/>
-          <w:sz w:val="29"/>
-          <w:sz-cs w:val="29"/>
-          <w:color w:val="0E121D"/>
-        </w:rPr>
-        <w:t xml:space="preserve"/>
-        <w:tab/>
-        <w:t xml:space="preserve">•</w:t>
-        <w:tab/>
-        <w:t xml:space="preserve"/>
-      </w:r>
-      <w:r>
-        <w:rPr>
-          <w:rFonts w:ascii="Helvetica Neue" w:hAnsi="Helvetica Neue" w:cs="Helvetica Neue"/>
-          <w:sz w:val="29"/>
-          <w:sz-cs w:val="29"/>
-          <w:spacing w:val="0"/>
-          <w:color w:val="0E121D"/>
-        </w:rPr>
-        <w:t xml:space="preserve">WiPay processing – estimated 4.5%</w:t>
-      </w:r>
-    </w:p>
-    <w:p>
-      <w:pPr>
-        <w:ind w:left="720" w:first-line="-720"/>
-        <w:spacing w:after="80"/>
-      </w:pPr>
-      <w:r>
-        <w:rPr>
-          <w:rFonts w:ascii="Helvetica Neue" w:hAnsi="Helvetica Neue" w:cs="Helvetica Neue"/>
-          <w:sz w:val="29"/>
-          <w:sz-cs w:val="29"/>
-          <w:color w:val="0E121D"/>
-        </w:rPr>
-        <w:t xml:space="preserve"/>
-        <w:tab/>
-        <w:t xml:space="preserve">•</w:t>
-        <w:tab/>
-        <w:t xml:space="preserve"/>
-      </w:r>
-      <w:r>
-        <w:rPr>
-          <w:rFonts w:ascii="Helvetica Neue" w:hAnsi="Helvetica Neue" w:cs="Helvetica Neue"/>
-          <w:sz w:val="29"/>
-          <w:sz-cs w:val="29"/>
-          <w:spacing w:val="0"/>
-          <w:color w:val="0E121D"/>
-        </w:rPr>
-        <w:t xml:space="preserve">Miscellaneous allowance – $50/mo</w:t>
+        <w:t xml:space="preserve">PDFMonkey: Starter – €5/mo (≈ $5.77 USD)</w:t>
+      </w:r>
+    </w:p>
+    <w:p>
+      <w:pPr>
+        <w:ind w:left="720" w:first-line="-720"/>
+        <w:spacing w:after="80"/>
+      </w:pPr>
+      <w:r>
+        <w:rPr>
+          <w:rFonts w:ascii="Helvetica Neue" w:hAnsi="Helvetica Neue" w:cs="Helvetica Neue"/>
+          <w:sz w:val="29"/>
+          <w:sz-cs w:val="29"/>
+          <w:color w:val="0E121D"/>
+        </w:rPr>
+        <w:t xml:space="preserve"/>
+        <w:tab/>
+        <w:t xml:space="preserve">•</w:t>
+        <w:tab/>
+        <w:t xml:space="preserve"/>
+      </w:r>
+      <w:r>
+        <w:rPr>
+          <w:rFonts w:ascii="Helvetica Neue" w:hAnsi="Helvetica Neue" w:cs="Helvetica Neue"/>
+          <w:sz w:val="29"/>
+          <w:sz-cs w:val="29"/>
+          <w:spacing w:val="0"/>
+          <w:color w:val="0E121D"/>
+        </w:rPr>
+        <w:t xml:space="preserve">WiPay processing – published Jamaica examples: 4.20% + GCT or 3.80% + GCT on paid plans</w:t>
+      </w:r>
+    </w:p>
+    <w:p>
+      <w:pPr>
+        <w:ind w:left="720" w:first-line="-720"/>
+        <w:spacing w:after="80"/>
+      </w:pPr>
+      <w:r>
+        <w:rPr>
+          <w:rFonts w:ascii="Helvetica Neue" w:hAnsi="Helvetica Neue" w:cs="Helvetica Neue"/>
+          <w:sz w:val="29"/>
+          <w:sz-cs w:val="29"/>
+          <w:color w:val="0E121D"/>
+        </w:rPr>
+        <w:t xml:space="preserve"/>
+        <w:tab/>
+        <w:t xml:space="preserve">•</w:t>
+        <w:tab/>
+        <w:t xml:space="preserve"/>
+      </w:r>
+      <w:r>
+        <w:rPr>
+          <w:rFonts w:ascii="Helvetica Neue" w:hAnsi="Helvetica Neue" w:cs="Helvetica Neue"/>
+          <w:sz w:val="29"/>
+          <w:sz-cs w:val="29"/>
+          <w:spacing w:val="0"/>
+          <w:color w:val="0E121D"/>
+        </w:rPr>
+        <w:t xml:space="preserve">Miscellaneous allowance – $25/mo</w:t>
       </w:r>
     </w:p>
     <w:p>
@@ -3305,7 +3305,7 @@
           <w:spacing w:val="0"/>
           <w:color w:val="0E121D"/>
         </w:rPr>
-        <w:t xml:space="preserve">$84.00/mo</w:t>
+        <w:t xml:space="preserve">$100.00/mo</w:t>
       </w:r>
       <w:r>
         <w:rPr>
@@ -3347,7 +3347,7 @@
           <w:spacing w:val="0"/>
           <w:color w:val="0E121D"/>
         </w:rPr>
-        <w:t xml:space="preserve">$5.95/mo</w:t>
+        <w:t xml:space="preserve">$105.77/mo</w:t>
       </w:r>
       <w:r>
         <w:rPr>
@@ -3394,7 +3394,7 @@
           <w:spacing w:val="0"/>
           <w:color w:val="0E121D"/>
         </w:rPr>
-        <w:t xml:space="preserve">$89.95/mo</w:t>
+        <w:t xml:space="preserve">$105.77/mo</w:t>
       </w:r>
       <w:r>
         <w:rPr>
@@ -3415,7 +3415,7 @@
           <w:spacing w:val="0"/>
           <w:color w:val="0E121D"/>
         </w:rPr>
-        <w:t xml:space="preserve">JMD 14,049.75/mo</w:t>
+        <w:t xml:space="preserve">JMD 16,562.74/mo</w:t>
       </w:r>
       <w:r>
         <w:rPr>
@@ -3440,7 +3440,7 @@
           <w:spacing w:val="0"/>
           <w:color w:val="3B4350"/>
         </w:rPr>
-        <w:t xml:space="preserve">(excludes Neon usage + WiPay variable fees)</w:t>
+        <w:t xml:space="preserve">(excludes Neon usage and any WiPay paid-plan fees)</w:t>
       </w:r>
     </w:p>
     <w:p>
@@ -3453,7 +3453,7 @@
           <w:spacing w:val="0"/>
           <w:color w:val="3B4350"/>
         </w:rPr>
-        <w:t xml:space="preserve">Neon usage-based + WiPay ~4.5% of online payments processed</w:t>
+        <w:t xml:space="preserve">Neon usage-based + WiPay processing at the merchant rate you are approved for</w:t>
       </w:r>
     </w:p>
     <w:p>
@@ -3468,7 +3468,7 @@
           <w:spacing w:val="0"/>
           <w:color w:val="3B4350"/>
         </w:rPr>
-        <w:t xml:space="preserve">Exchange rate snapshot used for conversions: 1 EUR = 1.18952 USD; 1 USD = 156.199241 JMD (last update UTC: Wed, 11 Feb 2026 00:02:31 +0000). </w:t>
+        <w:t xml:space="preserve">Exchange-rate examples above use rounded planning conversions as of March 28, 2026. Re-check taxes and FX before go-live. </w:t>
       </w:r>
     </w:p>
     <w:p>
@@ -3915,36 +3915,36 @@
           <w:spacing w:val="0"/>
           <w:color w:val="0E121D"/>
         </w:rPr>
-        <w:t xml:space="preserve">Third-party accounts (Netlify, Neon, WiPay, Resend, PDFMonkey, Uploadcare) must be created/owned by the site owner.</w:t>
-      </w:r>
-    </w:p>
-    <w:p>
-      <w:pPr>
-        <w:ind w:left="720" w:first-line="-720"/>
-        <w:spacing w:after="80"/>
-      </w:pPr>
-      <w:r>
-        <w:rPr>
-          <w:rFonts w:ascii="Helvetica Neue" w:hAnsi="Helvetica Neue" w:cs="Helvetica Neue"/>
-          <w:sz w:val="29"/>
-          <w:sz-cs w:val="29"/>
-          <w:color w:val="0E121D"/>
-        </w:rPr>
-        <w:t xml:space="preserve"/>
-        <w:tab/>
-        <w:t xml:space="preserve">•</w:t>
-        <w:tab/>
-        <w:t xml:space="preserve"/>
-      </w:r>
-      <w:r>
-        <w:rPr>
-          <w:rFonts w:ascii="Helvetica Neue" w:hAnsi="Helvetica Neue" w:cs="Helvetica Neue"/>
-          <w:sz w:val="29"/>
-          <w:sz-cs w:val="29"/>
-          <w:spacing w:val="0"/>
-          <w:color w:val="0E121D"/>
-        </w:rPr>
-        <w:t xml:space="preserve">WiPay live activation is subject to merchant onboarding/approval and provision of live credentials.</w:t>
+        <w:t xml:space="preserve">Accounts required before initial launch are Netlify, Postgres/Neon, Resend, and PDFMonkey. WiPay and Uploadcare only need to be activated if those features are turned on.</w:t>
+      </w:r>
+    </w:p>
+    <w:p>
+      <w:pPr>
+        <w:ind w:left="720" w:first-line="-720"/>
+        <w:spacing w:after="80"/>
+      </w:pPr>
+      <w:r>
+        <w:rPr>
+          <w:rFonts w:ascii="Helvetica Neue" w:hAnsi="Helvetica Neue" w:cs="Helvetica Neue"/>
+          <w:sz w:val="29"/>
+          <w:sz-cs w:val="29"/>
+          <w:color w:val="0E121D"/>
+        </w:rPr>
+        <w:t xml:space="preserve"/>
+        <w:tab/>
+        <w:t xml:space="preserve">•</w:t>
+        <w:tab/>
+        <w:t xml:space="preserve"/>
+      </w:r>
+      <w:r>
+        <w:rPr>
+          <w:rFonts w:ascii="Helvetica Neue" w:hAnsi="Helvetica Neue" w:cs="Helvetica Neue"/>
+          <w:sz w:val="29"/>
+          <w:sz-cs w:val="29"/>
+          <w:spacing w:val="0"/>
+          <w:color w:val="0E121D"/>
+        </w:rPr>
+        <w:t xml:space="preserve">WiPay live activation can be deferred until merchant onboarding is complete, live credentials are issued, and one small real payment has been tested end-to-end.</w:t>
       </w:r>
     </w:p>
     <w:p>
@@ -4018,36 +4018,36 @@
           <w:spacing w:val="0"/>
           <w:color w:val="0E121D"/>
         </w:rPr>
-        <w:t xml:space="preserve">Payment processing is handled by the payment gateway; the site should not store raw card data.</w:t>
-      </w:r>
-    </w:p>
-    <w:p>
-      <w:pPr>
-        <w:ind w:left="720" w:first-line="-720"/>
-        <w:spacing w:after="80"/>
-      </w:pPr>
-      <w:r>
-        <w:rPr>
-          <w:rFonts w:ascii="Helvetica Neue" w:hAnsi="Helvetica Neue" w:cs="Helvetica Neue"/>
-          <w:sz w:val="29"/>
-          <w:sz-cs w:val="29"/>
-          <w:color w:val="0E121D"/>
-        </w:rPr>
-        <w:t xml:space="preserve"/>
-        <w:tab/>
-        <w:t xml:space="preserve">•</w:t>
-        <w:tab/>
-        <w:t xml:space="preserve"/>
-      </w:r>
-      <w:r>
-        <w:rPr>
-          <w:rFonts w:ascii="Helvetica Neue" w:hAnsi="Helvetica Neue" w:cs="Helvetica Neue"/>
-          <w:sz w:val="29"/>
-          <w:sz-cs w:val="29"/>
-          <w:spacing w:val="0"/>
-          <w:color w:val="0E121D"/>
-        </w:rPr>
-        <w:t xml:space="preserve">Final ongoing costs depend heavily on traffic, booking volume, emails, PDF invoices, and image bandwidth.</w:t>
+        <w:t xml:space="preserve">Payment processing is handled by the gateway; the site should not store raw card data. Online payments can remain disabled at launch until WiPay is ready.</w:t>
+      </w:r>
+    </w:p>
+    <w:p>
+      <w:pPr>
+        <w:ind w:left="720" w:first-line="-720"/>
+        <w:spacing w:after="80"/>
+      </w:pPr>
+      <w:r>
+        <w:rPr>
+          <w:rFonts w:ascii="Helvetica Neue" w:hAnsi="Helvetica Neue" w:cs="Helvetica Neue"/>
+          <w:sz w:val="29"/>
+          <w:sz-cs w:val="29"/>
+          <w:color w:val="0E121D"/>
+        </w:rPr>
+        <w:t xml:space="preserve"/>
+        <w:tab/>
+        <w:t xml:space="preserve">•</w:t>
+        <w:tab/>
+        <w:t xml:space="preserve"/>
+      </w:r>
+      <w:r>
+        <w:rPr>
+          <w:rFonts w:ascii="Helvetica Neue" w:hAnsi="Helvetica Neue" w:cs="Helvetica Neue"/>
+          <w:sz w:val="29"/>
+          <w:sz-cs w:val="29"/>
+          <w:spacing w:val="0"/>
+          <w:color w:val="0E121D"/>
+        </w:rPr>
+        <w:t xml:space="preserve">Final ongoing costs depend heavily on traffic, booking volume, emails, PDF invoices, database usage, and whether Uploadcare/WiPay are enabled.</w:t>
       </w:r>
     </w:p>
     <w:p>
@@ -4092,7 +4092,7 @@
           <w:spacing w:val="0"/>
           <w:color w:val="3B4350"/>
         </w:rPr>
-        <w:t xml:space="preserve">Netlify Pricing: https://www.netlify.com/pricing/</w:t>
+        <w:t xml:space="preserve">Netlify Pricing: https://www.netlify.com/pricing/?category=developer</w:t>
       </w:r>
     </w:p>
     <w:p>
@@ -4237,7 +4237,7 @@
           <w:spacing w:val="0"/>
           <w:color w:val="3B4350"/>
         </w:rPr>
-        <w:t xml:space="preserve">WiPay Caribbean (pricing varies): https://wipaycaribbean.com/pricing</w:t>
+        <w:t xml:space="preserve">WiPay Merchant Signup: https://wipayfinancial.com/concierge/signup</w:t>
       </w:r>
     </w:p>
     <w:p>
@@ -4266,7 +4266,7 @@
           <w:spacing w:val="0"/>
           <w:color w:val="3B4350"/>
         </w:rPr>
-        <w:t xml:space="preserve">WiPay Online Payments: https://wipaycaribbean.com/solutions/online-payments</w:t>
+        <w:t xml:space="preserve">WiPay API Documentation: https://wipaycaribbean.com/WiPay-API-Documentation.pdf</w:t>
       </w:r>
     </w:p>
     <w:p>

</xml_diff>